<commit_message>
feat: normalize ranking calculation, fix delivery approval IDs, and update level thresholds
</commit_message>
<xml_diff>
--- a/Plan_Implementacion_EcoPuntos_Pamplona_V2.docx
+++ b/Plan_Implementacion_EcoPuntos_Pamplona_V2.docx
@@ -161,7 +161,7 @@
     <w:tbl>
       <w:tblPr>
         <w:tblStyle w:val="9"/>
-        <w:tblW w:w="8640" w:type="dxa"/>
+        <w:tblW w:w="8770" w:type="dxa"/>
         <w:tblInd w:w="0" w:type="dxa"/>
         <w:tblBorders>
           <w:top w:val="single" w:color="auto" w:sz="4" w:space="0"/>
@@ -181,9 +181,8 @@
       </w:tblPr>
       <w:tblGrid>
         <w:gridCol w:w="1239"/>
-        <w:gridCol w:w="1875"/>
         <w:gridCol w:w="2163"/>
-        <w:gridCol w:w="3363"/>
+        <w:gridCol w:w="5368"/>
       </w:tblGrid>
       <w:tr>
         <w:tblPrEx>
@@ -207,7 +206,7 @@
         </w:trPr>
         <w:tc>
           <w:tcPr>
-            <w:tcW w:w="1100" w:type="dxa"/>
+            <w:tcW w:w="1239" w:type="dxa"/>
             <w:tcBorders>
               <w:top w:val="single" w:color="BDC3C7" w:sz="4" w:space="0"/>
               <w:left w:val="single" w:color="BDC3C7" w:sz="4" w:space="0"/>
@@ -238,7 +237,7 @@
         </w:tc>
         <w:tc>
           <w:tcPr>
-            <w:tcW w:w="1900" w:type="dxa"/>
+            <w:tcW w:w="2163" w:type="dxa"/>
             <w:tcBorders>
               <w:top w:val="single" w:color="BDC3C7" w:sz="4" w:space="0"/>
               <w:left w:val="single" w:color="BDC3C7" w:sz="4" w:space="0"/>
@@ -263,44 +262,15 @@
                 <w:sz w:val="18"/>
                 <w:szCs w:val="18"/>
               </w:rPr>
-              <w:t>Stack Anterior</w:t>
-            </w:r>
-          </w:p>
-        </w:tc>
-        <w:tc>
-          <w:tcPr>
-            <w:tcW w:w="2200" w:type="dxa"/>
-            <w:tcBorders>
-              <w:top w:val="single" w:color="BDC3C7" w:sz="4" w:space="0"/>
-              <w:left w:val="single" w:color="BDC3C7" w:sz="4" w:space="0"/>
-              <w:bottom w:val="single" w:color="BDC3C7" w:sz="4" w:space="0"/>
-              <w:right w:val="single" w:color="BDC3C7" w:sz="4" w:space="0"/>
-            </w:tcBorders>
-            <w:shd w:val="clear" w:color="auto" w:fill="27AE60"/>
-            <w:tcMar>
-              <w:top w:w="70" w:type="dxa"/>
-              <w:left w:w="100" w:type="dxa"/>
-              <w:bottom w:w="70" w:type="dxa"/>
-              <w:right w:w="100" w:type="dxa"/>
-            </w:tcMar>
-          </w:tcPr>
-          <w:p>
-            <w:r>
-              <w:rPr>
-                <w:rFonts w:ascii="Calibri" w:hAnsi="Calibri" w:eastAsia="Calibri" w:cs="Calibri"/>
-                <w:b/>
-                <w:bCs/>
-                <w:color w:val="FFFFFF"/>
-                <w:sz w:val="18"/>
-                <w:szCs w:val="18"/>
-              </w:rPr>
-              <w:t>Stack Actual</w:t>
-            </w:r>
-          </w:p>
-        </w:tc>
-        <w:tc>
-          <w:tcPr>
-            <w:tcW w:w="3440" w:type="dxa"/>
+              <w:t xml:space="preserve">Stack </w:t>
+            </w:r>
+            <w:bookmarkStart w:id="0" w:name="_GoBack"/>
+            <w:bookmarkEnd w:id="0"/>
+          </w:p>
+        </w:tc>
+        <w:tc>
+          <w:tcPr>
+            <w:tcW w:w="5368" w:type="dxa"/>
             <w:tcBorders>
               <w:top w:val="single" w:color="BDC3C7" w:sz="4" w:space="0"/>
               <w:left w:val="single" w:color="BDC3C7" w:sz="4" w:space="0"/>
@@ -352,7 +322,7 @@
         </w:trPr>
         <w:tc>
           <w:tcPr>
-            <w:tcW w:w="1100" w:type="dxa"/>
+            <w:tcW w:w="1239" w:type="dxa"/>
             <w:tcBorders>
               <w:top w:val="single" w:color="BDC3C7" w:sz="4" w:space="0"/>
               <w:left w:val="single" w:color="BDC3C7" w:sz="4" w:space="0"/>
@@ -382,37 +352,7 @@
         </w:tc>
         <w:tc>
           <w:tcPr>
-            <w:tcW w:w="1900" w:type="dxa"/>
-            <w:tcBorders>
-              <w:top w:val="single" w:color="BDC3C7" w:sz="4" w:space="0"/>
-              <w:left w:val="single" w:color="BDC3C7" w:sz="4" w:space="0"/>
-              <w:bottom w:val="single" w:color="BDC3C7" w:sz="4" w:space="0"/>
-              <w:right w:val="single" w:color="BDC3C7" w:sz="4" w:space="0"/>
-            </w:tcBorders>
-            <w:tcMar>
-              <w:top w:w="70" w:type="dxa"/>
-              <w:left w:w="100" w:type="dxa"/>
-              <w:bottom w:w="70" w:type="dxa"/>
-              <w:right w:w="100" w:type="dxa"/>
-            </w:tcMar>
-          </w:tcPr>
-          <w:p>
-            <w:r>
-              <w:rPr>
-                <w:rFonts w:ascii="Calibri" w:hAnsi="Calibri" w:eastAsia="Calibri" w:cs="Calibri"/>
-                <w:b w:val="0"/>
-                <w:bCs w:val="0"/>
-                <w:color w:val="333333"/>
-                <w:sz w:val="18"/>
-                <w:szCs w:val="18"/>
-              </w:rPr>
-              <w:t>Vanilla JS + HTML5 (PWA)</w:t>
-            </w:r>
-          </w:p>
-        </w:tc>
-        <w:tc>
-          <w:tcPr>
-            <w:tcW w:w="2200" w:type="dxa"/>
+            <w:tcW w:w="2163" w:type="dxa"/>
             <w:tcBorders>
               <w:top w:val="single" w:color="BDC3C7" w:sz="4" w:space="0"/>
               <w:left w:val="single" w:color="BDC3C7" w:sz="4" w:space="0"/>
@@ -442,7 +382,7 @@
         </w:tc>
         <w:tc>
           <w:tcPr>
-            <w:tcW w:w="3440" w:type="dxa"/>
+            <w:tcW w:w="5368" w:type="dxa"/>
             <w:tcBorders>
               <w:top w:val="single" w:color="BDC3C7" w:sz="4" w:space="0"/>
               <w:left w:val="single" w:color="BDC3C7" w:sz="4" w:space="0"/>
@@ -493,7 +433,7 @@
         </w:trPr>
         <w:tc>
           <w:tcPr>
-            <w:tcW w:w="1100" w:type="dxa"/>
+            <w:tcW w:w="1239" w:type="dxa"/>
             <w:tcBorders>
               <w:top w:val="single" w:color="BDC3C7" w:sz="4" w:space="0"/>
               <w:left w:val="single" w:color="BDC3C7" w:sz="4" w:space="0"/>
@@ -524,7 +464,7 @@
         </w:tc>
         <w:tc>
           <w:tcPr>
-            <w:tcW w:w="1900" w:type="dxa"/>
+            <w:tcW w:w="2163" w:type="dxa"/>
             <w:tcBorders>
               <w:top w:val="single" w:color="BDC3C7" w:sz="4" w:space="0"/>
               <w:left w:val="single" w:color="BDC3C7" w:sz="4" w:space="0"/>
@@ -549,44 +489,13 @@
                 <w:sz w:val="18"/>
                 <w:szCs w:val="18"/>
               </w:rPr>
-              <w:t>Node.js + Express.js</w:t>
-            </w:r>
-          </w:p>
-        </w:tc>
-        <w:tc>
-          <w:tcPr>
-            <w:tcW w:w="2200" w:type="dxa"/>
-            <w:tcBorders>
-              <w:top w:val="single" w:color="BDC3C7" w:sz="4" w:space="0"/>
-              <w:left w:val="single" w:color="BDC3C7" w:sz="4" w:space="0"/>
-              <w:bottom w:val="single" w:color="BDC3C7" w:sz="4" w:space="0"/>
-              <w:right w:val="single" w:color="BDC3C7" w:sz="4" w:space="0"/>
-            </w:tcBorders>
-            <w:shd w:val="clear" w:color="auto" w:fill="F4F7F3"/>
-            <w:tcMar>
-              <w:top w:w="70" w:type="dxa"/>
-              <w:left w:w="100" w:type="dxa"/>
-              <w:bottom w:w="70" w:type="dxa"/>
-              <w:right w:w="100" w:type="dxa"/>
-            </w:tcMar>
-          </w:tcPr>
-          <w:p>
-            <w:r>
-              <w:rPr>
-                <w:rFonts w:ascii="Calibri" w:hAnsi="Calibri" w:eastAsia="Calibri" w:cs="Calibri"/>
-                <w:b w:val="0"/>
-                <w:bCs w:val="0"/>
-                <w:color w:val="333333"/>
-                <w:sz w:val="18"/>
-                <w:szCs w:val="18"/>
-              </w:rPr>
               <w:t>FastAPI (Python 3.13)</w:t>
             </w:r>
           </w:p>
         </w:tc>
         <w:tc>
           <w:tcPr>
-            <w:tcW w:w="3440" w:type="dxa"/>
+            <w:tcW w:w="5368" w:type="dxa"/>
             <w:tcBorders>
               <w:top w:val="single" w:color="BDC3C7" w:sz="4" w:space="0"/>
               <w:left w:val="single" w:color="BDC3C7" w:sz="4" w:space="0"/>
@@ -638,7 +547,7 @@
         </w:trPr>
         <w:tc>
           <w:tcPr>
-            <w:tcW w:w="1100" w:type="dxa"/>
+            <w:tcW w:w="1239" w:type="dxa"/>
             <w:tcBorders>
               <w:top w:val="single" w:color="BDC3C7" w:sz="4" w:space="0"/>
               <w:left w:val="single" w:color="BDC3C7" w:sz="4" w:space="0"/>
@@ -668,7 +577,7 @@
         </w:tc>
         <w:tc>
           <w:tcPr>
-            <w:tcW w:w="1900" w:type="dxa"/>
+            <w:tcW w:w="2163" w:type="dxa"/>
             <w:tcBorders>
               <w:top w:val="single" w:color="BDC3C7" w:sz="4" w:space="0"/>
               <w:left w:val="single" w:color="BDC3C7" w:sz="4" w:space="0"/>
@@ -698,37 +607,7 @@
         </w:tc>
         <w:tc>
           <w:tcPr>
-            <w:tcW w:w="2200" w:type="dxa"/>
-            <w:tcBorders>
-              <w:top w:val="single" w:color="BDC3C7" w:sz="4" w:space="0"/>
-              <w:left w:val="single" w:color="BDC3C7" w:sz="4" w:space="0"/>
-              <w:bottom w:val="single" w:color="BDC3C7" w:sz="4" w:space="0"/>
-              <w:right w:val="single" w:color="BDC3C7" w:sz="4" w:space="0"/>
-            </w:tcBorders>
-            <w:tcMar>
-              <w:top w:w="70" w:type="dxa"/>
-              <w:left w:w="100" w:type="dxa"/>
-              <w:bottom w:w="70" w:type="dxa"/>
-              <w:right w:w="100" w:type="dxa"/>
-            </w:tcMar>
-          </w:tcPr>
-          <w:p>
-            <w:r>
-              <w:rPr>
-                <w:rFonts w:ascii="Calibri" w:hAnsi="Calibri" w:eastAsia="Calibri" w:cs="Calibri"/>
-                <w:b w:val="0"/>
-                <w:bCs w:val="0"/>
-                <w:color w:val="333333"/>
-                <w:sz w:val="18"/>
-                <w:szCs w:val="18"/>
-              </w:rPr>
-              <w:t>PostgreSQL 15 + PostGIS 3.3</w:t>
-            </w:r>
-          </w:p>
-        </w:tc>
-        <w:tc>
-          <w:tcPr>
-            <w:tcW w:w="3440" w:type="dxa"/>
+            <w:tcW w:w="5368" w:type="dxa"/>
             <w:tcBorders>
               <w:top w:val="single" w:color="BDC3C7" w:sz="4" w:space="0"/>
               <w:left w:val="single" w:color="BDC3C7" w:sz="4" w:space="0"/>
@@ -779,7 +658,7 @@
         </w:trPr>
         <w:tc>
           <w:tcPr>
-            <w:tcW w:w="1100" w:type="dxa"/>
+            <w:tcW w:w="1239" w:type="dxa"/>
             <w:tcBorders>
               <w:top w:val="single" w:color="BDC3C7" w:sz="4" w:space="0"/>
               <w:left w:val="single" w:color="BDC3C7" w:sz="4" w:space="0"/>
@@ -810,7 +689,7 @@
         </w:tc>
         <w:tc>
           <w:tcPr>
-            <w:tcW w:w="1900" w:type="dxa"/>
+            <w:tcW w:w="2163" w:type="dxa"/>
             <w:tcBorders>
               <w:top w:val="single" w:color="BDC3C7" w:sz="4" w:space="0"/>
               <w:left w:val="single" w:color="BDC3C7" w:sz="4" w:space="0"/>
@@ -835,44 +714,13 @@
                 <w:sz w:val="18"/>
                 <w:szCs w:val="18"/>
               </w:rPr>
-              <w:t>SQL crudo con pg (node-postgres)</w:t>
-            </w:r>
-          </w:p>
-        </w:tc>
-        <w:tc>
-          <w:tcPr>
-            <w:tcW w:w="2200" w:type="dxa"/>
-            <w:tcBorders>
-              <w:top w:val="single" w:color="BDC3C7" w:sz="4" w:space="0"/>
-              <w:left w:val="single" w:color="BDC3C7" w:sz="4" w:space="0"/>
-              <w:bottom w:val="single" w:color="BDC3C7" w:sz="4" w:space="0"/>
-              <w:right w:val="single" w:color="BDC3C7" w:sz="4" w:space="0"/>
-            </w:tcBorders>
-            <w:shd w:val="clear" w:color="auto" w:fill="F4F7F3"/>
-            <w:tcMar>
-              <w:top w:w="70" w:type="dxa"/>
-              <w:left w:w="100" w:type="dxa"/>
-              <w:bottom w:w="70" w:type="dxa"/>
-              <w:right w:w="100" w:type="dxa"/>
-            </w:tcMar>
-          </w:tcPr>
-          <w:p>
-            <w:r>
-              <w:rPr>
-                <w:rFonts w:ascii="Calibri" w:hAnsi="Calibri" w:eastAsia="Calibri" w:cs="Calibri"/>
-                <w:b w:val="0"/>
-                <w:bCs w:val="0"/>
-                <w:color w:val="333333"/>
-                <w:sz w:val="18"/>
-                <w:szCs w:val="18"/>
-              </w:rPr>
               <w:t>SQLAlchemy 2.1 (Python)</w:t>
             </w:r>
           </w:p>
         </w:tc>
         <w:tc>
           <w:tcPr>
-            <w:tcW w:w="3440" w:type="dxa"/>
+            <w:tcW w:w="5368" w:type="dxa"/>
             <w:tcBorders>
               <w:top w:val="single" w:color="BDC3C7" w:sz="4" w:space="0"/>
               <w:left w:val="single" w:color="BDC3C7" w:sz="4" w:space="0"/>
@@ -924,7 +772,7 @@
         </w:trPr>
         <w:tc>
           <w:tcPr>
-            <w:tcW w:w="1100" w:type="dxa"/>
+            <w:tcW w:w="1239" w:type="dxa"/>
             <w:tcBorders>
               <w:top w:val="single" w:color="BDC3C7" w:sz="4" w:space="0"/>
               <w:left w:val="single" w:color="BDC3C7" w:sz="4" w:space="0"/>
@@ -954,37 +802,7 @@
         </w:tc>
         <w:tc>
           <w:tcPr>
-            <w:tcW w:w="1900" w:type="dxa"/>
-            <w:tcBorders>
-              <w:top w:val="single" w:color="BDC3C7" w:sz="4" w:space="0"/>
-              <w:left w:val="single" w:color="BDC3C7" w:sz="4" w:space="0"/>
-              <w:bottom w:val="single" w:color="BDC3C7" w:sz="4" w:space="0"/>
-              <w:right w:val="single" w:color="BDC3C7" w:sz="4" w:space="0"/>
-            </w:tcBorders>
-            <w:tcMar>
-              <w:top w:w="70" w:type="dxa"/>
-              <w:left w:w="100" w:type="dxa"/>
-              <w:bottom w:w="70" w:type="dxa"/>
-              <w:right w:w="100" w:type="dxa"/>
-            </w:tcMar>
-          </w:tcPr>
-          <w:p>
-            <w:r>
-              <w:rPr>
-                <w:rFonts w:ascii="Calibri" w:hAnsi="Calibri" w:eastAsia="Calibri" w:cs="Calibri"/>
-                <w:b w:val="0"/>
-                <w:bCs w:val="0"/>
-                <w:color w:val="333333"/>
-                <w:sz w:val="18"/>
-                <w:szCs w:val="18"/>
-              </w:rPr>
-              <w:t>JWT con jsonwebtoken (Node)</w:t>
-            </w:r>
-          </w:p>
-        </w:tc>
-        <w:tc>
-          <w:tcPr>
-            <w:tcW w:w="2200" w:type="dxa"/>
+            <w:tcW w:w="2163" w:type="dxa"/>
             <w:tcBorders>
               <w:top w:val="single" w:color="BDC3C7" w:sz="4" w:space="0"/>
               <w:left w:val="single" w:color="BDC3C7" w:sz="4" w:space="0"/>
@@ -1014,7 +832,7 @@
         </w:tc>
         <w:tc>
           <w:tcPr>
-            <w:tcW w:w="3440" w:type="dxa"/>
+            <w:tcW w:w="5368" w:type="dxa"/>
             <w:tcBorders>
               <w:top w:val="single" w:color="BDC3C7" w:sz="4" w:space="0"/>
               <w:left w:val="single" w:color="BDC3C7" w:sz="4" w:space="0"/>
@@ -12529,10 +12347,7 @@
         </w:tc>
       </w:tr>
     </w:tbl>
-    <w:p>
-      <w:bookmarkStart w:id="0" w:name="_GoBack"/>
-      <w:bookmarkEnd w:id="0"/>
-    </w:p>
+    <w:p/>
     <w:sectPr>
       <w:footerReference r:id="rId3" w:type="default"/>
       <w:pgSz w:w="12240" w:h="15840"/>
@@ -12673,7 +12488,7 @@
     <w:lsdException w:unhideWhenUsed="0" w:uiPriority="0" w:semiHidden="0" w:name="table of figures"/>
     <w:lsdException w:unhideWhenUsed="0" w:uiPriority="0" w:semiHidden="0" w:name="envelope address"/>
     <w:lsdException w:unhideWhenUsed="0" w:uiPriority="0" w:semiHidden="0" w:name="envelope return"/>
-    <w:lsdException w:uiPriority="99" w:name="footnote reference"/>
+    <w:lsdException w:qFormat="1" w:uiPriority="99" w:name="footnote reference"/>
     <w:lsdException w:unhideWhenUsed="0" w:uiPriority="0" w:semiHidden="0" w:name="annotation reference"/>
     <w:lsdException w:unhideWhenUsed="0" w:uiPriority="0" w:semiHidden="0" w:name="line number"/>
     <w:lsdException w:unhideWhenUsed="0" w:uiPriority="0" w:semiHidden="0" w:name="page number"/>
@@ -12700,7 +12515,7 @@
     <w:lsdException w:qFormat="1" w:unhideWhenUsed="0" w:uiPriority="0" w:semiHidden="0" w:name="Title"/>
     <w:lsdException w:unhideWhenUsed="0" w:uiPriority="0" w:semiHidden="0" w:name="Closing"/>
     <w:lsdException w:unhideWhenUsed="0" w:uiPriority="0" w:semiHidden="0" w:name="Signature"/>
-    <w:lsdException w:unhideWhenUsed="0" w:uiPriority="0" w:name="Default Paragraph Font"/>
+    <w:lsdException w:qFormat="1" w:unhideWhenUsed="0" w:uiPriority="0" w:name="Default Paragraph Font"/>
     <w:lsdException w:unhideWhenUsed="0" w:uiPriority="0" w:semiHidden="0" w:name="Body Text"/>
     <w:lsdException w:unhideWhenUsed="0" w:uiPriority="0" w:semiHidden="0" w:name="Body Text Indent"/>
     <w:lsdException w:unhideWhenUsed="0" w:uiPriority="0" w:semiHidden="0" w:name="List Continue"/>
@@ -12874,6 +12689,7 @@
   <w:style w:type="character" w:default="1" w:styleId="8">
     <w:name w:val="Default Paragraph Font"/>
     <w:semiHidden/>
+    <w:qFormat/>
     <w:uiPriority w:val="0"/>
   </w:style>
   <w:style w:type="table" w:default="1" w:styleId="9">
@@ -12904,6 +12720,7 @@
     <w:name w:val="footnote reference"/>
     <w:semiHidden/>
     <w:unhideWhenUsed/>
+    <w:qFormat/>
     <w:uiPriority w:val="99"/>
     <w:rPr>
       <w:vertAlign w:val="superscript"/>

</xml_diff>